<commit_message>
feat: Commit de 16h03 contient une base non testee
</commit_message>
<xml_diff>
--- a/contrôle_codesign_FPGA_2025_2026.docx
+++ b/contrôle_codesign_FPGA_2025_2026.docx
@@ -2967,7 +2967,7 @@
                 <w:szCs w:val="22"/>
                 <w:rtl w:val="0"/>
               </w:rPr>
-              <w:t xml:space="preserve"> </w:t>
+              <w:t xml:space="preserve"> data_ir</w:t>
             </w:r>
             <w:r>
               <w:rPr>
@@ -2994,7 +2994,7 @@
                 <w:szCs w:val="22"/>
                 <w:rtl w:val="0"/>
               </w:rPr>
-              <w:t xml:space="preserve"> </w:t>
+              <w:t xml:space="preserve"> entrée</w:t>
             </w:r>
             <w:r>
               <w:rPr>
@@ -3021,7 +3021,7 @@
                 <w:szCs w:val="22"/>
                 <w:rtl w:val="0"/>
               </w:rPr>
-              <w:t xml:space="preserve"> </w:t>
+              <w:t xml:space="preserve"> 8 bits</w:t>
             </w:r>
             <w:r>
               <w:rPr>
@@ -3044,16 +3044,23 @@
             </w:pPr>
             <w:r>
               <w:rPr>
-                <w:sz w:val="22"/>
-                <w:szCs w:val="22"/>
-                <w:rtl w:val="0"/>
-              </w:rPr>
-              <w:t xml:space="preserve"> </w:t>
-            </w:r>
-            <w:r>
-              <w:rPr>
-                <w:rtl w:val="0"/>
-              </w:rPr>
+                <w:rtl w:val="0"/>
+              </w:rPr>
+              <w:t xml:space="preserve">P</w:t>
+            </w:r>
+            <w:r>
+              <w:rPr>
+                <w:sz w:val="22"/>
+                <w:szCs w:val="22"/>
+                <w:rtl w:val="0"/>
+              </w:rPr>
+              <w:t xml:space="preserve">remier opérande non signé, issu d’un canal capteur ou d’un registre </w:t>
+            </w:r>
+            <w:r>
+              <w:rPr>
+                <w:rtl w:val="0"/>
+              </w:rPr>
+              <w:t xml:space="preserve">software</w:t>
             </w:r>
           </w:p>
         </w:tc>
@@ -3081,7 +3088,7 @@
                 <w:szCs w:val="22"/>
                 <w:rtl w:val="0"/>
               </w:rPr>
-              <w:t xml:space="preserve"> </w:t>
+              <w:t xml:space="preserve"> data_jr</w:t>
             </w:r>
             <w:r>
               <w:rPr>
@@ -3108,7 +3115,7 @@
                 <w:szCs w:val="22"/>
                 <w:rtl w:val="0"/>
               </w:rPr>
-              <w:t xml:space="preserve"> </w:t>
+              <w:t xml:space="preserve"> entrée</w:t>
             </w:r>
             <w:r>
               <w:rPr>
@@ -3135,7 +3142,7 @@
                 <w:szCs w:val="22"/>
                 <w:rtl w:val="0"/>
               </w:rPr>
-              <w:t xml:space="preserve"> </w:t>
+              <w:t xml:space="preserve"> 8 bits</w:t>
             </w:r>
             <w:r>
               <w:rPr>
@@ -3158,11 +3165,17 @@
             </w:pPr>
             <w:r>
               <w:rPr>
-                <w:sz w:val="22"/>
-                <w:szCs w:val="22"/>
-                <w:rtl w:val="0"/>
-              </w:rPr>
-              <w:t xml:space="preserve"> </w:t>
+                <w:rtl w:val="0"/>
+              </w:rPr>
+              <w:t xml:space="preserve">S</w:t>
+            </w:r>
+            <w:r>
+              <w:rPr>
+                <w:sz w:val="22"/>
+                <w:szCs w:val="22"/>
+                <w:rtl w:val="0"/>
+              </w:rPr>
+              <w:t xml:space="preserve">econd opérande non signé</w:t>
             </w:r>
             <w:r>
               <w:rPr>
@@ -3195,7 +3208,7 @@
                 <w:szCs w:val="22"/>
                 <w:rtl w:val="0"/>
               </w:rPr>
-              <w:t xml:space="preserve"> </w:t>
+              <w:t xml:space="preserve"> op_sel</w:t>
             </w:r>
             <w:r>
               <w:rPr>
@@ -3222,7 +3235,7 @@
                 <w:szCs w:val="22"/>
                 <w:rtl w:val="0"/>
               </w:rPr>
-              <w:t xml:space="preserve"> </w:t>
+              <w:t xml:space="preserve"> entrée</w:t>
             </w:r>
             <w:r>
               <w:rPr>
@@ -3249,7 +3262,7 @@
                 <w:szCs w:val="22"/>
                 <w:rtl w:val="0"/>
               </w:rPr>
-              <w:t xml:space="preserve"> </w:t>
+              <w:t xml:space="preserve"> 2 bits</w:t>
             </w:r>
             <w:r>
               <w:rPr>
@@ -3272,11 +3285,17 @@
             </w:pPr>
             <w:r>
               <w:rPr>
-                <w:sz w:val="22"/>
-                <w:szCs w:val="22"/>
-                <w:rtl w:val="0"/>
-              </w:rPr>
-              <w:t xml:space="preserve"> </w:t>
+                <w:rtl w:val="0"/>
+              </w:rPr>
+              <w:t xml:space="preserve">S</w:t>
+            </w:r>
+            <w:r>
+              <w:rPr>
+                <w:sz w:val="22"/>
+                <w:szCs w:val="22"/>
+                <w:rtl w:val="0"/>
+              </w:rPr>
+              <w:t xml:space="preserve">élection de l’opération à effectuer</w:t>
             </w:r>
             <w:r>
               <w:rPr>
@@ -3309,7 +3328,7 @@
                 <w:szCs w:val="22"/>
                 <w:rtl w:val="0"/>
               </w:rPr>
-              <w:t xml:space="preserve"> </w:t>
+              <w:t xml:space="preserve"> result </w:t>
             </w:r>
             <w:r>
               <w:rPr>
@@ -3336,7 +3355,7 @@
                 <w:szCs w:val="22"/>
                 <w:rtl w:val="0"/>
               </w:rPr>
-              <w:t xml:space="preserve"> </w:t>
+              <w:t xml:space="preserve"> entrée</w:t>
             </w:r>
             <w:r>
               <w:rPr>
@@ -3363,7 +3382,7 @@
                 <w:szCs w:val="22"/>
                 <w:rtl w:val="0"/>
               </w:rPr>
-              <w:t xml:space="preserve"> </w:t>
+              <w:t xml:space="preserve"> 16 bits</w:t>
             </w:r>
             <w:r>
               <w:rPr>
@@ -3386,358 +3405,9 @@
             </w:pPr>
             <w:r>
               <w:rPr>
-                <w:sz w:val="22"/>
-                <w:szCs w:val="22"/>
-                <w:rtl w:val="0"/>
-              </w:rPr>
-              <w:t xml:space="preserve"> </w:t>
-            </w:r>
-            <w:r>
-              <w:rPr>
-                <w:rtl w:val="0"/>
-              </w:rPr>
-            </w:r>
-          </w:p>
-        </w:tc>
-      </w:tr>
-      <w:tr>
-        <w:trPr>
-          <w:cantSplit w:val="0"/>
-          <w:tblHeader w:val="0"/>
-        </w:trPr>
-        <w:tc>
-          <w:tcPr>
-            <w:tcBorders>
-              <w:top w:color="000000" w:space="0" w:sz="4" w:val="single"/>
-              <w:bottom w:color="000000" w:space="0" w:sz="4" w:val="single"/>
-            </w:tcBorders>
-          </w:tcPr>
-          <w:p>
-            <w:pPr>
-              <w:spacing w:after="120" w:before="0" w:lineRule="auto"/>
-              <w:rPr/>
-            </w:pPr>
-            <w:r>
-              <w:rPr>
-                <w:sz w:val="22"/>
-                <w:szCs w:val="22"/>
-                <w:rtl w:val="0"/>
-              </w:rPr>
-              <w:t xml:space="preserve"> </w:t>
-            </w:r>
-            <w:r>
-              <w:rPr>
-                <w:rtl w:val="0"/>
-              </w:rPr>
-            </w:r>
-          </w:p>
-        </w:tc>
-        <w:tc>
-          <w:tcPr>
-            <w:tcBorders>
-              <w:top w:color="000000" w:space="0" w:sz="4" w:val="single"/>
-              <w:bottom w:color="000000" w:space="0" w:sz="4" w:val="single"/>
-            </w:tcBorders>
-          </w:tcPr>
-          <w:p>
-            <w:pPr>
-              <w:spacing w:after="120" w:before="0" w:lineRule="auto"/>
-              <w:rPr/>
-            </w:pPr>
-            <w:r>
-              <w:rPr>
-                <w:sz w:val="22"/>
-                <w:szCs w:val="22"/>
-                <w:rtl w:val="0"/>
-              </w:rPr>
-              <w:t xml:space="preserve"> </w:t>
-            </w:r>
-            <w:r>
-              <w:rPr>
-                <w:rtl w:val="0"/>
-              </w:rPr>
-            </w:r>
-          </w:p>
-        </w:tc>
-        <w:tc>
-          <w:tcPr>
-            <w:tcBorders>
-              <w:top w:color="000000" w:space="0" w:sz="4" w:val="single"/>
-              <w:bottom w:color="000000" w:space="0" w:sz="4" w:val="single"/>
-            </w:tcBorders>
-          </w:tcPr>
-          <w:p>
-            <w:pPr>
-              <w:spacing w:after="120" w:before="0" w:lineRule="auto"/>
-              <w:rPr/>
-            </w:pPr>
-            <w:r>
-              <w:rPr>
-                <w:sz w:val="22"/>
-                <w:szCs w:val="22"/>
-                <w:rtl w:val="0"/>
-              </w:rPr>
-              <w:t xml:space="preserve"> </w:t>
-            </w:r>
-            <w:r>
-              <w:rPr>
-                <w:rtl w:val="0"/>
-              </w:rPr>
-            </w:r>
-          </w:p>
-        </w:tc>
-        <w:tc>
-          <w:tcPr>
-            <w:tcBorders>
-              <w:top w:color="000000" w:space="0" w:sz="4" w:val="single"/>
-              <w:bottom w:color="000000" w:space="0" w:sz="4" w:val="single"/>
-            </w:tcBorders>
-          </w:tcPr>
-          <w:p>
-            <w:pPr>
-              <w:spacing w:after="120" w:before="0" w:lineRule="auto"/>
-              <w:rPr/>
-            </w:pPr>
-            <w:r>
-              <w:rPr>
-                <w:sz w:val="22"/>
-                <w:szCs w:val="22"/>
-                <w:rtl w:val="0"/>
-              </w:rPr>
-              <w:t xml:space="preserve"> </w:t>
-            </w:r>
-            <w:r>
-              <w:rPr>
-                <w:rtl w:val="0"/>
-              </w:rPr>
-            </w:r>
-          </w:p>
-        </w:tc>
-      </w:tr>
-      <w:tr>
-        <w:trPr>
-          <w:cantSplit w:val="0"/>
-          <w:tblHeader w:val="0"/>
-        </w:trPr>
-        <w:tc>
-          <w:tcPr>
-            <w:tcBorders>
-              <w:top w:color="000000" w:space="0" w:sz="4" w:val="single"/>
-              <w:bottom w:color="000000" w:space="0" w:sz="4" w:val="single"/>
-            </w:tcBorders>
-          </w:tcPr>
-          <w:p>
-            <w:pPr>
-              <w:spacing w:after="120" w:before="0" w:lineRule="auto"/>
-              <w:rPr/>
-            </w:pPr>
-            <w:r>
-              <w:rPr>
-                <w:sz w:val="22"/>
-                <w:szCs w:val="22"/>
-                <w:rtl w:val="0"/>
-              </w:rPr>
-              <w:t xml:space="preserve"> </w:t>
-            </w:r>
-            <w:r>
-              <w:rPr>
-                <w:rtl w:val="0"/>
-              </w:rPr>
-            </w:r>
-          </w:p>
-        </w:tc>
-        <w:tc>
-          <w:tcPr>
-            <w:tcBorders>
-              <w:top w:color="000000" w:space="0" w:sz="4" w:val="single"/>
-              <w:bottom w:color="000000" w:space="0" w:sz="4" w:val="single"/>
-            </w:tcBorders>
-          </w:tcPr>
-          <w:p>
-            <w:pPr>
-              <w:spacing w:after="120" w:before="0" w:lineRule="auto"/>
-              <w:rPr/>
-            </w:pPr>
-            <w:r>
-              <w:rPr>
-                <w:sz w:val="22"/>
-                <w:szCs w:val="22"/>
-                <w:rtl w:val="0"/>
-              </w:rPr>
-              <w:t xml:space="preserve"> </w:t>
-            </w:r>
-            <w:r>
-              <w:rPr>
-                <w:rtl w:val="0"/>
-              </w:rPr>
-            </w:r>
-          </w:p>
-        </w:tc>
-        <w:tc>
-          <w:tcPr>
-            <w:tcBorders>
-              <w:top w:color="000000" w:space="0" w:sz="4" w:val="single"/>
-              <w:bottom w:color="000000" w:space="0" w:sz="4" w:val="single"/>
-            </w:tcBorders>
-          </w:tcPr>
-          <w:p>
-            <w:pPr>
-              <w:spacing w:after="120" w:before="0" w:lineRule="auto"/>
-              <w:rPr/>
-            </w:pPr>
-            <w:r>
-              <w:rPr>
-                <w:sz w:val="22"/>
-                <w:szCs w:val="22"/>
-                <w:rtl w:val="0"/>
-              </w:rPr>
-              <w:t xml:space="preserve"> </w:t>
-            </w:r>
-            <w:r>
-              <w:rPr>
-                <w:rtl w:val="0"/>
-              </w:rPr>
-            </w:r>
-          </w:p>
-        </w:tc>
-        <w:tc>
-          <w:tcPr>
-            <w:tcBorders>
-              <w:top w:color="000000" w:space="0" w:sz="4" w:val="single"/>
-              <w:bottom w:color="000000" w:space="0" w:sz="4" w:val="single"/>
-            </w:tcBorders>
-          </w:tcPr>
-          <w:p>
-            <w:pPr>
-              <w:spacing w:after="120" w:before="0" w:lineRule="auto"/>
-              <w:rPr/>
-            </w:pPr>
-            <w:r>
-              <w:rPr>
-                <w:sz w:val="22"/>
-                <w:szCs w:val="22"/>
-                <w:rtl w:val="0"/>
-              </w:rPr>
-              <w:t xml:space="preserve"> </w:t>
-            </w:r>
-            <w:r>
-              <w:rPr>
-                <w:rtl w:val="0"/>
-              </w:rPr>
-            </w:r>
-          </w:p>
-        </w:tc>
-      </w:tr>
-      <w:tr>
-        <w:trPr>
-          <w:cantSplit w:val="0"/>
-          <w:tblHeader w:val="0"/>
-        </w:trPr>
-        <w:tc>
-          <w:tcPr>
-            <w:tcBorders>
-              <w:top w:color="000000" w:space="0" w:sz="4" w:val="single"/>
-              <w:bottom w:color="000000" w:space="0" w:sz="4" w:val="single"/>
-            </w:tcBorders>
-          </w:tcPr>
-          <w:p>
-            <w:pPr>
-              <w:spacing w:after="120" w:before="0" w:lineRule="auto"/>
-              <w:rPr/>
-            </w:pPr>
-            <w:r>
-              <w:rPr>
-                <w:sz w:val="22"/>
-                <w:szCs w:val="22"/>
-                <w:rtl w:val="0"/>
-              </w:rPr>
-              <w:t xml:space="preserve"> </w:t>
-            </w:r>
-            <w:r>
-              <w:rPr>
-                <w:rtl w:val="0"/>
-              </w:rPr>
-            </w:r>
-          </w:p>
-        </w:tc>
-        <w:tc>
-          <w:tcPr>
-            <w:tcBorders>
-              <w:top w:color="000000" w:space="0" w:sz="4" w:val="single"/>
-              <w:bottom w:color="000000" w:space="0" w:sz="4" w:val="single"/>
-            </w:tcBorders>
-          </w:tcPr>
-          <w:p>
-            <w:pPr>
-              <w:spacing w:after="120" w:before="0" w:lineRule="auto"/>
-              <w:rPr/>
-            </w:pPr>
-            <w:r>
-              <w:rPr>
-                <w:sz w:val="22"/>
-                <w:szCs w:val="22"/>
-                <w:rtl w:val="0"/>
-              </w:rPr>
-              <w:t xml:space="preserve"> </w:t>
-            </w:r>
-            <w:r>
-              <w:rPr>
-                <w:rtl w:val="0"/>
-              </w:rPr>
-            </w:r>
-          </w:p>
-        </w:tc>
-        <w:tc>
-          <w:tcPr>
-            <w:tcBorders>
-              <w:top w:color="000000" w:space="0" w:sz="4" w:val="single"/>
-              <w:bottom w:color="000000" w:space="0" w:sz="4" w:val="single"/>
-            </w:tcBorders>
-          </w:tcPr>
-          <w:p>
-            <w:pPr>
-              <w:spacing w:after="120" w:before="0" w:lineRule="auto"/>
-              <w:rPr/>
-            </w:pPr>
-            <w:r>
-              <w:rPr>
-                <w:sz w:val="22"/>
-                <w:szCs w:val="22"/>
-                <w:rtl w:val="0"/>
-              </w:rPr>
-              <w:t xml:space="preserve"> </w:t>
-            </w:r>
-            <w:r>
-              <w:rPr>
-                <w:rtl w:val="0"/>
-              </w:rPr>
-            </w:r>
-          </w:p>
-        </w:tc>
-        <w:tc>
-          <w:tcPr>
-            <w:tcBorders>
-              <w:top w:color="000000" w:space="0" w:sz="4" w:val="single"/>
-              <w:bottom w:color="000000" w:space="0" w:sz="4" w:val="single"/>
-            </w:tcBorders>
-          </w:tcPr>
-          <w:p>
-            <w:pPr>
-              <w:spacing w:after="120" w:before="0" w:lineRule="auto"/>
-              <w:rPr/>
-            </w:pPr>
-            <w:r>
-              <w:rPr>
-                <w:sz w:val="22"/>
-                <w:szCs w:val="22"/>
-                <w:rtl w:val="0"/>
-              </w:rPr>
-              <w:t xml:space="preserve"> </w:t>
-            </w:r>
-            <w:r>
-              <w:rPr>
-                <w:rtl w:val="0"/>
-              </w:rPr>
+                <w:rtl w:val="0"/>
+              </w:rPr>
+              <w:t xml:space="preserve">Résultat du calcul (nous l’avons élargi pour éviter l’overflow)</w:t>
             </w:r>
           </w:p>
         </w:tc>
@@ -5036,52 +4706,9 @@
             </w:pPr>
             <w:r>
               <w:rPr>
-                <w:sz w:val="22"/>
-                <w:szCs w:val="22"/>
-                <w:rtl w:val="0"/>
-              </w:rPr>
-              <w:t xml:space="preserve"> </w:t>
-            </w:r>
-            <w:r>
-              <w:rPr>
-                <w:rtl w:val="0"/>
-              </w:rPr>
-            </w:r>
-          </w:p>
-          <w:p>
-            <w:pPr>
-              <w:rPr/>
-            </w:pPr>
-            <w:r>
-              <w:rPr>
-                <w:sz w:val="22"/>
-                <w:szCs w:val="22"/>
-                <w:rtl w:val="0"/>
-              </w:rPr>
-              <w:t xml:space="preserve"> </w:t>
-            </w:r>
-            <w:r>
-              <w:rPr>
-                <w:rtl w:val="0"/>
-              </w:rPr>
-            </w:r>
-          </w:p>
-          <w:p>
-            <w:pPr>
-              <w:rPr/>
-            </w:pPr>
-            <w:r>
-              <w:rPr>
-                <w:sz w:val="22"/>
-                <w:szCs w:val="22"/>
-                <w:rtl w:val="0"/>
-              </w:rPr>
-              <w:t xml:space="preserve"> </w:t>
-            </w:r>
-            <w:r>
-              <w:rPr>
-                <w:rtl w:val="0"/>
-              </w:rPr>
+                <w:rtl w:val="0"/>
+              </w:rPr>
+              <w:t xml:space="preserve">Pour résoudre cette contrainte, nous utiliserons une PLL qui prendra en entrée cette horloge de 50MHz et donnera en sortie les 40MHz d’horloge que nous attendons </w:t>
             </w:r>
           </w:p>
           <w:p>

</xml_diff>

<commit_message>
feat: Ajout du bloc calculateur, nettoyage du projet
</commit_message>
<xml_diff>
--- a/contrôle_codesign_FPGA_2025_2026.docx
+++ b/contrôle_codesign_FPGA_2025_2026.docx
@@ -364,7 +364,7 @@
               <w:widowControl w:val="1"/>
               <w:numPr>
                 <w:ilvl w:val="0"/>
-                <w:numId w:val="1"/>
+                <w:numId w:val="3"/>
               </w:numPr>
               <w:pBdr>
                 <w:top w:space="0" w:sz="0" w:val="nil"/>
@@ -421,7 +421,7 @@
               <w:widowControl w:val="1"/>
               <w:numPr>
                 <w:ilvl w:val="0"/>
-                <w:numId w:val="1"/>
+                <w:numId w:val="3"/>
               </w:numPr>
               <w:pBdr>
                 <w:top w:space="0" w:sz="0" w:val="nil"/>
@@ -478,7 +478,7 @@
               <w:widowControl w:val="1"/>
               <w:numPr>
                 <w:ilvl w:val="0"/>
-                <w:numId w:val="1"/>
+                <w:numId w:val="3"/>
               </w:numPr>
               <w:pBdr>
                 <w:top w:space="0" w:sz="0" w:val="nil"/>
@@ -535,7 +535,7 @@
               <w:widowControl w:val="1"/>
               <w:numPr>
                 <w:ilvl w:val="0"/>
-                <w:numId w:val="1"/>
+                <w:numId w:val="3"/>
               </w:numPr>
               <w:pBdr>
                 <w:top w:space="0" w:sz="0" w:val="nil"/>
@@ -592,7 +592,7 @@
               <w:widowControl w:val="1"/>
               <w:numPr>
                 <w:ilvl w:val="0"/>
-                <w:numId w:val="1"/>
+                <w:numId w:val="3"/>
               </w:numPr>
               <w:pBdr>
                 <w:top w:space="0" w:sz="0" w:val="nil"/>
@@ -649,7 +649,7 @@
               <w:widowControl w:val="1"/>
               <w:numPr>
                 <w:ilvl w:val="0"/>
-                <w:numId w:val="1"/>
+                <w:numId w:val="3"/>
               </w:numPr>
               <w:pBdr>
                 <w:top w:space="0" w:sz="0" w:val="nil"/>
@@ -706,7 +706,7 @@
               <w:widowControl w:val="1"/>
               <w:numPr>
                 <w:ilvl w:val="0"/>
-                <w:numId w:val="1"/>
+                <w:numId w:val="3"/>
               </w:numPr>
               <w:pBdr>
                 <w:top w:space="0" w:sz="0" w:val="nil"/>
@@ -782,7 +782,7 @@
               <w:widowControl w:val="1"/>
               <w:numPr>
                 <w:ilvl w:val="0"/>
-                <w:numId w:val="1"/>
+                <w:numId w:val="3"/>
               </w:numPr>
               <w:pBdr>
                 <w:top w:space="0" w:sz="0" w:val="nil"/>
@@ -839,7 +839,7 @@
               <w:widowControl w:val="1"/>
               <w:numPr>
                 <w:ilvl w:val="0"/>
-                <w:numId w:val="1"/>
+                <w:numId w:val="3"/>
               </w:numPr>
               <w:pBdr>
                 <w:top w:space="0" w:sz="0" w:val="nil"/>
@@ -896,7 +896,7 @@
               <w:widowControl w:val="1"/>
               <w:numPr>
                 <w:ilvl w:val="0"/>
-                <w:numId w:val="1"/>
+                <w:numId w:val="3"/>
               </w:numPr>
               <w:pBdr>
                 <w:top w:space="0" w:sz="0" w:val="nil"/>
@@ -1015,7 +1015,7 @@
               <w:widowControl w:val="1"/>
               <w:numPr>
                 <w:ilvl w:val="0"/>
-                <w:numId w:val="1"/>
+                <w:numId w:val="3"/>
               </w:numPr>
               <w:pBdr>
                 <w:top w:space="0" w:sz="0" w:val="nil"/>
@@ -4346,7 +4346,21 @@
                 <w:szCs w:val="22"/>
                 <w:rtl w:val="0"/>
               </w:rPr>
-              <w:t xml:space="preserve"> </w:t>
+              <w:t xml:space="preserve">Créer un nouveau projet Quartus II 13.0 avec File &gt; New Project Wizard, choisir le répertoire de travail, donner un nom au projet, puis définir </w:t>
+            </w:r>
+            <w:r>
+              <w:rPr>
+                <w:rtl w:val="0"/>
+              </w:rPr>
+              <w:t xml:space="preserve">le fichier top level</w:t>
+            </w:r>
+            <w:r>
+              <w:rPr>
+                <w:sz w:val="22"/>
+                <w:szCs w:val="22"/>
+                <w:rtl w:val="0"/>
+              </w:rPr>
+              <w:t xml:space="preserve">. Dans l’étape de sélection du composant, choisir la famille Cyclone IV E et le circuit exact DE0-Nano.</w:t>
             </w:r>
             <w:r>
               <w:rPr>
@@ -4426,6 +4440,7 @@
       <w:tr>
         <w:trPr>
           <w:cantSplit w:val="0"/>
+          <w:trHeight w:val="640.95703125" w:hRule="atLeast"/>
           <w:tblHeader w:val="0"/>
         </w:trPr>
         <w:tc>
@@ -4436,20 +4451,120 @@
           </w:tcPr>
           <w:p>
             <w:pPr>
-              <w:rPr/>
-            </w:pPr>
-            <w:r>
-              <w:rPr>
-                <w:sz w:val="22"/>
-                <w:szCs w:val="22"/>
+              <w:rPr>
+                <w:sz w:val="22"/>
+                <w:szCs w:val="22"/>
+              </w:rPr>
+            </w:pPr>
+            <w:r>
+              <w:rPr>
+                <w:sz w:val="22"/>
+                <w:szCs w:val="22"/>
+                <w:rtl w:val="0"/>
+              </w:rPr>
+              <w:t xml:space="preserve">Ajouter les fichiers sources capteurs_sol.vhd, calculateur_cable.vhd et un fichier top-level. Si l’on respecte la contrainte d’horloge du module capteurs</w:t>
+            </w:r>
+            <w:r>
+              <w:rPr>
                 <w:rtl w:val="0"/>
               </w:rPr>
               <w:t xml:space="preserve"> </w:t>
             </w:r>
             <w:r>
               <w:rPr>
-                <w:rtl w:val="0"/>
-              </w:rPr>
+                <w:sz w:val="22"/>
+                <w:szCs w:val="22"/>
+                <w:rtl w:val="0"/>
+              </w:rPr>
+              <w:t xml:space="preserve">il faut aussi générer et ajouter un bloc PLL fournissant clk_40M. </w:t>
+            </w:r>
+            <w:r>
+              <w:rPr>
+                <w:rtl w:val="0"/>
+              </w:rPr>
+              <w:t xml:space="preserve">Le fichier top-level </w:t>
+            </w:r>
+            <w:r>
+              <w:rPr>
+                <w:sz w:val="22"/>
+                <w:szCs w:val="22"/>
+                <w:rtl w:val="0"/>
+              </w:rPr>
+              <w:t xml:space="preserve">instancie au minimum :</w:t>
+            </w:r>
+          </w:p>
+          <w:p>
+            <w:pPr>
+              <w:numPr>
+                <w:ilvl w:val="0"/>
+                <w:numId w:val="2"/>
+              </w:numPr>
+              <w:ind w:left="720" w:hanging="360"/>
+              <w:rPr>
+                <w:u w:val="none"/>
+              </w:rPr>
+            </w:pPr>
+            <w:r>
+              <w:rPr>
+                <w:rtl w:val="0"/>
+              </w:rPr>
+              <w:t xml:space="preserve">la PLL,</w:t>
+            </w:r>
+          </w:p>
+          <w:p>
+            <w:pPr>
+              <w:numPr>
+                <w:ilvl w:val="0"/>
+                <w:numId w:val="2"/>
+              </w:numPr>
+              <w:ind w:left="720" w:hanging="360"/>
+              <w:rPr>
+                <w:u w:val="none"/>
+              </w:rPr>
+            </w:pPr>
+            <w:r>
+              <w:rPr>
+                <w:rtl w:val="0"/>
+              </w:rPr>
+              <w:t xml:space="preserve">capteurs_sol,</w:t>
+            </w:r>
+          </w:p>
+          <w:p>
+            <w:pPr>
+              <w:numPr>
+                <w:ilvl w:val="0"/>
+                <w:numId w:val="2"/>
+              </w:numPr>
+              <w:ind w:left="720" w:hanging="360"/>
+              <w:rPr>
+                <w:u w:val="none"/>
+              </w:rPr>
+            </w:pPr>
+            <w:r>
+              <w:rPr>
+                <w:rtl w:val="0"/>
+              </w:rPr>
+              <w:t xml:space="preserve">le calculateur câblé,</w:t>
+            </w:r>
+          </w:p>
+          <w:p>
+            <w:pPr>
+              <w:numPr>
+                <w:ilvl w:val="0"/>
+                <w:numId w:val="2"/>
+              </w:numPr>
+              <w:ind w:left="720" w:hanging="360"/>
+              <w:rPr>
+                <w:u w:val="none"/>
+              </w:rPr>
+            </w:pPr>
+            <w:r>
+              <w:rPr>
+                <w:rtl w:val="0"/>
+              </w:rPr>
+              <w:t xml:space="preserve">Les registres de sortie résultat et quelques registres d’entrée pour piloter </w:t>
+              <w:tab/>
+              <w:t xml:space="preserve">les opérandes depuis le logiciel.</w:t>
             </w:r>
           </w:p>
           <w:p>
@@ -4534,21 +4649,194 @@
           </w:tcPr>
           <w:p>
             <w:pPr>
-              <w:rPr/>
-            </w:pPr>
-            <w:r>
-              <w:rPr>
-                <w:sz w:val="22"/>
-                <w:szCs w:val="22"/>
-                <w:rtl w:val="0"/>
-              </w:rPr>
-              <w:t xml:space="preserve"> </w:t>
-            </w:r>
-            <w:r>
-              <w:rPr>
-                <w:rtl w:val="0"/>
-              </w:rPr>
-            </w:r>
+              <w:rPr>
+                <w:sz w:val="22"/>
+                <w:szCs w:val="22"/>
+              </w:rPr>
+            </w:pPr>
+            <w:r>
+              <w:rPr>
+                <w:sz w:val="22"/>
+                <w:szCs w:val="22"/>
+                <w:rtl w:val="0"/>
+              </w:rPr>
+              <w:t xml:space="preserve">Les contraintes minimales à déclarer sont :</w:t>
+            </w:r>
+          </w:p>
+          <w:p>
+            <w:pPr>
+              <w:numPr>
+                <w:ilvl w:val="0"/>
+                <w:numId w:val="4"/>
+              </w:numPr>
+              <w:ind w:left="720" w:hanging="360"/>
+              <w:rPr>
+                <w:sz w:val="22"/>
+                <w:szCs w:val="22"/>
+                <w:u w:val="none"/>
+              </w:rPr>
+            </w:pPr>
+            <w:r>
+              <w:rPr>
+                <w:sz w:val="22"/>
+                <w:szCs w:val="22"/>
+                <w:rtl w:val="0"/>
+              </w:rPr>
+              <w:t xml:space="preserve">l’horloge d’entrée 50 MHz de la DE0-Nano ;</w:t>
+            </w:r>
+          </w:p>
+          <w:p>
+            <w:pPr>
+              <w:numPr>
+                <w:ilvl w:val="0"/>
+                <w:numId w:val="4"/>
+              </w:numPr>
+              <w:ind w:left="720" w:hanging="360"/>
+              <w:rPr>
+                <w:sz w:val="22"/>
+                <w:szCs w:val="22"/>
+                <w:u w:val="none"/>
+              </w:rPr>
+            </w:pPr>
+            <w:r>
+              <w:rPr>
+                <w:sz w:val="22"/>
+                <w:szCs w:val="22"/>
+                <w:rtl w:val="0"/>
+              </w:rPr>
+              <w:t xml:space="preserve">les quatre signaux SPI du LTC2308 reliés à capteurs_sol ;</w:t>
+            </w:r>
+          </w:p>
+          <w:p>
+            <w:pPr>
+              <w:ind w:left="720" w:firstLine="0"/>
+              <w:rPr/>
+            </w:pPr>
+            <w:r>
+              <w:rPr>
+                <w:rtl w:val="0"/>
+              </w:rPr>
+            </w:r>
+          </w:p>
+          <w:p>
+            <w:pPr>
+              <w:ind w:left="0" w:firstLine="0"/>
+              <w:rPr/>
+            </w:pPr>
+            <w:r>
+              <w:rPr>
+                <w:rtl w:val="0"/>
+              </w:rPr>
+              <w:t xml:space="preserve">D’après le guide matériel fourni, les affectations minimales pour l’ADC A-Cute Car sont :</w:t>
+            </w:r>
+          </w:p>
+          <w:p>
+            <w:pPr>
+              <w:numPr>
+                <w:ilvl w:val="0"/>
+                <w:numId w:val="1"/>
+              </w:numPr>
+              <w:ind w:left="720" w:hanging="360"/>
+              <w:rPr>
+                <w:u w:val="none"/>
+              </w:rPr>
+            </w:pPr>
+            <w:sdt>
+              <w:sdtPr>
+                <w:id w:val="-1863554920"/>
+                <w:tag w:val="goog_rdk_0"/>
+              </w:sdtPr>
+              <w:sdtContent>
+                <w:r>
+                  <w:rPr>
+                    <w:rFonts w:ascii="Arial Unicode MS" w:cs="Arial Unicode MS" w:eastAsia="Arial Unicode MS" w:hAnsi="Arial Unicode MS"/>
+                    <w:rtl w:val="0"/>
+                  </w:rPr>
+                  <w:t xml:space="preserve">ADC_CONVST → PIN_A5</w:t>
+                </w:r>
+              </w:sdtContent>
+            </w:sdt>
+          </w:p>
+          <w:p>
+            <w:pPr>
+              <w:numPr>
+                <w:ilvl w:val="0"/>
+                <w:numId w:val="1"/>
+              </w:numPr>
+              <w:ind w:left="720" w:hanging="360"/>
+              <w:rPr>
+                <w:u w:val="none"/>
+              </w:rPr>
+            </w:pPr>
+            <w:sdt>
+              <w:sdtPr>
+                <w:id w:val="395201914"/>
+                <w:tag w:val="goog_rdk_1"/>
+              </w:sdtPr>
+              <w:sdtContent>
+                <w:r>
+                  <w:rPr>
+                    <w:rFonts w:ascii="Arial Unicode MS" w:cs="Arial Unicode MS" w:eastAsia="Arial Unicode MS" w:hAnsi="Arial Unicode MS"/>
+                    <w:rtl w:val="0"/>
+                  </w:rPr>
+                  <w:t xml:space="preserve">ADC_SCK → PIN_D5</w:t>
+                </w:r>
+              </w:sdtContent>
+            </w:sdt>
+          </w:p>
+          <w:p>
+            <w:pPr>
+              <w:numPr>
+                <w:ilvl w:val="0"/>
+                <w:numId w:val="1"/>
+              </w:numPr>
+              <w:ind w:left="720" w:hanging="360"/>
+              <w:rPr>
+                <w:u w:val="none"/>
+              </w:rPr>
+            </w:pPr>
+            <w:sdt>
+              <w:sdtPr>
+                <w:id w:val="-538324055"/>
+                <w:tag w:val="goog_rdk_2"/>
+              </w:sdtPr>
+              <w:sdtContent>
+                <w:r>
+                  <w:rPr>
+                    <w:rFonts w:ascii="Arial Unicode MS" w:cs="Arial Unicode MS" w:eastAsia="Arial Unicode MS" w:hAnsi="Arial Unicode MS"/>
+                    <w:rtl w:val="0"/>
+                  </w:rPr>
+                  <w:t xml:space="preserve">ADC_SDO → PIN_B6</w:t>
+                </w:r>
+              </w:sdtContent>
+            </w:sdt>
+          </w:p>
+          <w:p>
+            <w:pPr>
+              <w:numPr>
+                <w:ilvl w:val="0"/>
+                <w:numId w:val="1"/>
+              </w:numPr>
+              <w:ind w:left="720" w:hanging="360"/>
+              <w:rPr>
+                <w:u w:val="none"/>
+              </w:rPr>
+            </w:pPr>
+            <w:sdt>
+              <w:sdtPr>
+                <w:id w:val="-1343315102"/>
+                <w:tag w:val="goog_rdk_3"/>
+              </w:sdtPr>
+              <w:sdtContent>
+                <w:r>
+                  <w:rPr>
+                    <w:rFonts w:ascii="Arial Unicode MS" w:cs="Arial Unicode MS" w:eastAsia="Arial Unicode MS" w:hAnsi="Arial Unicode MS"/>
+                    <w:rtl w:val="0"/>
+                  </w:rPr>
+                  <w:t xml:space="preserve">ADC_SDI → PIN_A6</w:t>
+                </w:r>
+              </w:sdtContent>
+            </w:sdt>
           </w:p>
           <w:p>
             <w:pPr>
@@ -8250,6 +8538,226 @@
     <w:lvl w:ilvl="0">
       <w:start w:val="1"/>
       <w:numFmt w:val="bullet"/>
+      <w:lvlText w:val="-"/>
+      <w:lvlJc w:val="left"/>
+      <w:pPr>
+        <w:ind w:left="720" w:hanging="360"/>
+      </w:pPr>
+      <w:rPr>
+        <w:u w:val="none"/>
+      </w:rPr>
+    </w:lvl>
+    <w:lvl w:ilvl="1">
+      <w:start w:val="1"/>
+      <w:numFmt w:val="bullet"/>
+      <w:lvlText w:val="-"/>
+      <w:lvlJc w:val="left"/>
+      <w:pPr>
+        <w:ind w:left="1440" w:hanging="360"/>
+      </w:pPr>
+      <w:rPr>
+        <w:u w:val="none"/>
+      </w:rPr>
+    </w:lvl>
+    <w:lvl w:ilvl="2">
+      <w:start w:val="1"/>
+      <w:numFmt w:val="bullet"/>
+      <w:lvlText w:val="-"/>
+      <w:lvlJc w:val="left"/>
+      <w:pPr>
+        <w:ind w:left="2160" w:hanging="360"/>
+      </w:pPr>
+      <w:rPr>
+        <w:u w:val="none"/>
+      </w:rPr>
+    </w:lvl>
+    <w:lvl w:ilvl="3">
+      <w:start w:val="1"/>
+      <w:numFmt w:val="bullet"/>
+      <w:lvlText w:val="-"/>
+      <w:lvlJc w:val="left"/>
+      <w:pPr>
+        <w:ind w:left="2880" w:hanging="360"/>
+      </w:pPr>
+      <w:rPr>
+        <w:u w:val="none"/>
+      </w:rPr>
+    </w:lvl>
+    <w:lvl w:ilvl="4">
+      <w:start w:val="1"/>
+      <w:numFmt w:val="bullet"/>
+      <w:lvlText w:val="-"/>
+      <w:lvlJc w:val="left"/>
+      <w:pPr>
+        <w:ind w:left="3600" w:hanging="360"/>
+      </w:pPr>
+      <w:rPr>
+        <w:u w:val="none"/>
+      </w:rPr>
+    </w:lvl>
+    <w:lvl w:ilvl="5">
+      <w:start w:val="1"/>
+      <w:numFmt w:val="bullet"/>
+      <w:lvlText w:val="-"/>
+      <w:lvlJc w:val="left"/>
+      <w:pPr>
+        <w:ind w:left="4320" w:hanging="360"/>
+      </w:pPr>
+      <w:rPr>
+        <w:u w:val="none"/>
+      </w:rPr>
+    </w:lvl>
+    <w:lvl w:ilvl="6">
+      <w:start w:val="1"/>
+      <w:numFmt w:val="bullet"/>
+      <w:lvlText w:val="-"/>
+      <w:lvlJc w:val="left"/>
+      <w:pPr>
+        <w:ind w:left="5040" w:hanging="360"/>
+      </w:pPr>
+      <w:rPr>
+        <w:u w:val="none"/>
+      </w:rPr>
+    </w:lvl>
+    <w:lvl w:ilvl="7">
+      <w:start w:val="1"/>
+      <w:numFmt w:val="bullet"/>
+      <w:lvlText w:val="-"/>
+      <w:lvlJc w:val="left"/>
+      <w:pPr>
+        <w:ind w:left="5760" w:hanging="360"/>
+      </w:pPr>
+      <w:rPr>
+        <w:u w:val="none"/>
+      </w:rPr>
+    </w:lvl>
+    <w:lvl w:ilvl="8">
+      <w:start w:val="1"/>
+      <w:numFmt w:val="bullet"/>
+      <w:lvlText w:val="-"/>
+      <w:lvlJc w:val="left"/>
+      <w:pPr>
+        <w:ind w:left="6480" w:hanging="360"/>
+      </w:pPr>
+      <w:rPr>
+        <w:u w:val="none"/>
+      </w:rPr>
+    </w:lvl>
+  </w:abstractNum>
+  <w:abstractNum w:abstractNumId="2">
+    <w:lvl w:ilvl="0">
+      <w:start w:val="1"/>
+      <w:numFmt w:val="bullet"/>
+      <w:lvlText w:val="-"/>
+      <w:lvlJc w:val="left"/>
+      <w:pPr>
+        <w:ind w:left="720" w:hanging="360"/>
+      </w:pPr>
+      <w:rPr>
+        <w:u w:val="none"/>
+      </w:rPr>
+    </w:lvl>
+    <w:lvl w:ilvl="1">
+      <w:start w:val="1"/>
+      <w:numFmt w:val="bullet"/>
+      <w:lvlText w:val="-"/>
+      <w:lvlJc w:val="left"/>
+      <w:pPr>
+        <w:ind w:left="1440" w:hanging="360"/>
+      </w:pPr>
+      <w:rPr>
+        <w:u w:val="none"/>
+      </w:rPr>
+    </w:lvl>
+    <w:lvl w:ilvl="2">
+      <w:start w:val="1"/>
+      <w:numFmt w:val="bullet"/>
+      <w:lvlText w:val="-"/>
+      <w:lvlJc w:val="left"/>
+      <w:pPr>
+        <w:ind w:left="2160" w:hanging="360"/>
+      </w:pPr>
+      <w:rPr>
+        <w:u w:val="none"/>
+      </w:rPr>
+    </w:lvl>
+    <w:lvl w:ilvl="3">
+      <w:start w:val="1"/>
+      <w:numFmt w:val="bullet"/>
+      <w:lvlText w:val="-"/>
+      <w:lvlJc w:val="left"/>
+      <w:pPr>
+        <w:ind w:left="2880" w:hanging="360"/>
+      </w:pPr>
+      <w:rPr>
+        <w:u w:val="none"/>
+      </w:rPr>
+    </w:lvl>
+    <w:lvl w:ilvl="4">
+      <w:start w:val="1"/>
+      <w:numFmt w:val="bullet"/>
+      <w:lvlText w:val="-"/>
+      <w:lvlJc w:val="left"/>
+      <w:pPr>
+        <w:ind w:left="3600" w:hanging="360"/>
+      </w:pPr>
+      <w:rPr>
+        <w:u w:val="none"/>
+      </w:rPr>
+    </w:lvl>
+    <w:lvl w:ilvl="5">
+      <w:start w:val="1"/>
+      <w:numFmt w:val="bullet"/>
+      <w:lvlText w:val="-"/>
+      <w:lvlJc w:val="left"/>
+      <w:pPr>
+        <w:ind w:left="4320" w:hanging="360"/>
+      </w:pPr>
+      <w:rPr>
+        <w:u w:val="none"/>
+      </w:rPr>
+    </w:lvl>
+    <w:lvl w:ilvl="6">
+      <w:start w:val="1"/>
+      <w:numFmt w:val="bullet"/>
+      <w:lvlText w:val="-"/>
+      <w:lvlJc w:val="left"/>
+      <w:pPr>
+        <w:ind w:left="5040" w:hanging="360"/>
+      </w:pPr>
+      <w:rPr>
+        <w:u w:val="none"/>
+      </w:rPr>
+    </w:lvl>
+    <w:lvl w:ilvl="7">
+      <w:start w:val="1"/>
+      <w:numFmt w:val="bullet"/>
+      <w:lvlText w:val="-"/>
+      <w:lvlJc w:val="left"/>
+      <w:pPr>
+        <w:ind w:left="5760" w:hanging="360"/>
+      </w:pPr>
+      <w:rPr>
+        <w:u w:val="none"/>
+      </w:rPr>
+    </w:lvl>
+    <w:lvl w:ilvl="8">
+      <w:start w:val="1"/>
+      <w:numFmt w:val="bullet"/>
+      <w:lvlText w:val="-"/>
+      <w:lvlJc w:val="left"/>
+      <w:pPr>
+        <w:ind w:left="6480" w:hanging="360"/>
+      </w:pPr>
+      <w:rPr>
+        <w:u w:val="none"/>
+      </w:rPr>
+    </w:lvl>
+  </w:abstractNum>
+  <w:abstractNum w:abstractNumId="3">
+    <w:lvl w:ilvl="0">
+      <w:start w:val="1"/>
+      <w:numFmt w:val="bullet"/>
       <w:lvlText w:val="•"/>
       <w:lvlJc w:val="left"/>
       <w:pPr>
@@ -8342,8 +8850,127 @@
       <w:rPr/>
     </w:lvl>
   </w:abstractNum>
+  <w:abstractNum w:abstractNumId="4">
+    <w:lvl w:ilvl="0">
+      <w:start w:val="1"/>
+      <w:numFmt w:val="bullet"/>
+      <w:lvlText w:val="-"/>
+      <w:lvlJc w:val="left"/>
+      <w:pPr>
+        <w:ind w:left="720" w:hanging="360"/>
+      </w:pPr>
+      <w:rPr>
+        <w:u w:val="none"/>
+      </w:rPr>
+    </w:lvl>
+    <w:lvl w:ilvl="1">
+      <w:start w:val="1"/>
+      <w:numFmt w:val="bullet"/>
+      <w:lvlText w:val="-"/>
+      <w:lvlJc w:val="left"/>
+      <w:pPr>
+        <w:ind w:left="1440" w:hanging="360"/>
+      </w:pPr>
+      <w:rPr>
+        <w:u w:val="none"/>
+      </w:rPr>
+    </w:lvl>
+    <w:lvl w:ilvl="2">
+      <w:start w:val="1"/>
+      <w:numFmt w:val="bullet"/>
+      <w:lvlText w:val="-"/>
+      <w:lvlJc w:val="left"/>
+      <w:pPr>
+        <w:ind w:left="2160" w:hanging="360"/>
+      </w:pPr>
+      <w:rPr>
+        <w:u w:val="none"/>
+      </w:rPr>
+    </w:lvl>
+    <w:lvl w:ilvl="3">
+      <w:start w:val="1"/>
+      <w:numFmt w:val="bullet"/>
+      <w:lvlText w:val="-"/>
+      <w:lvlJc w:val="left"/>
+      <w:pPr>
+        <w:ind w:left="2880" w:hanging="360"/>
+      </w:pPr>
+      <w:rPr>
+        <w:u w:val="none"/>
+      </w:rPr>
+    </w:lvl>
+    <w:lvl w:ilvl="4">
+      <w:start w:val="1"/>
+      <w:numFmt w:val="bullet"/>
+      <w:lvlText w:val="-"/>
+      <w:lvlJc w:val="left"/>
+      <w:pPr>
+        <w:ind w:left="3600" w:hanging="360"/>
+      </w:pPr>
+      <w:rPr>
+        <w:u w:val="none"/>
+      </w:rPr>
+    </w:lvl>
+    <w:lvl w:ilvl="5">
+      <w:start w:val="1"/>
+      <w:numFmt w:val="bullet"/>
+      <w:lvlText w:val="-"/>
+      <w:lvlJc w:val="left"/>
+      <w:pPr>
+        <w:ind w:left="4320" w:hanging="360"/>
+      </w:pPr>
+      <w:rPr>
+        <w:u w:val="none"/>
+      </w:rPr>
+    </w:lvl>
+    <w:lvl w:ilvl="6">
+      <w:start w:val="1"/>
+      <w:numFmt w:val="bullet"/>
+      <w:lvlText w:val="-"/>
+      <w:lvlJc w:val="left"/>
+      <w:pPr>
+        <w:ind w:left="5040" w:hanging="360"/>
+      </w:pPr>
+      <w:rPr>
+        <w:u w:val="none"/>
+      </w:rPr>
+    </w:lvl>
+    <w:lvl w:ilvl="7">
+      <w:start w:val="1"/>
+      <w:numFmt w:val="bullet"/>
+      <w:lvlText w:val="-"/>
+      <w:lvlJc w:val="left"/>
+      <w:pPr>
+        <w:ind w:left="5760" w:hanging="360"/>
+      </w:pPr>
+      <w:rPr>
+        <w:u w:val="none"/>
+      </w:rPr>
+    </w:lvl>
+    <w:lvl w:ilvl="8">
+      <w:start w:val="1"/>
+      <w:numFmt w:val="bullet"/>
+      <w:lvlText w:val="-"/>
+      <w:lvlJc w:val="left"/>
+      <w:pPr>
+        <w:ind w:left="6480" w:hanging="360"/>
+      </w:pPr>
+      <w:rPr>
+        <w:u w:val="none"/>
+      </w:rPr>
+    </w:lvl>
+  </w:abstractNum>
   <w:num w:numId="1">
     <w:abstractNumId w:val="1"/>
+  </w:num>
+  <w:num w:numId="2">
+    <w:abstractNumId w:val="2"/>
+  </w:num>
+  <w:num w:numId="3">
+    <w:abstractNumId w:val="3"/>
+  </w:num>
+  <w:num w:numId="4">
+    <w:abstractNumId w:val="4"/>
   </w:num>
 </w:numbering>
 </file>
@@ -9127,7 +9754,7 @@
 
 <file path=customXML/item1.xml><?xml version="1.0" encoding="utf-8"?>
 <go:gDocsCustomXmlDataStorage xmlns:go="http://customooxmlschemas.google.com/" xmlns:r="http://schemas.openxmlformats.org/officeDocument/2006/relationships" uri="GoogleDocsCustomDataVersion2">
-  <go:docsCustomData xmlns:go="http://customooxmlschemas.google.com/" roundtripDataSignature="AMtx7mgZph5LzFV9Y8R3WuIQeZoSe6XjdQ==">CgMxLjA4AHIhMU42TVJ6TXRKYS1xLWhkVVM2ejRScG9qREE3dWEwSkdt</go:docsCustomData>
+  <go:docsCustomData xmlns:go="http://customooxmlschemas.google.com/" roundtripDataSignature="AMtx7mhjRW6PV2d6vjkJ80DmNILgOV0RZw==">CgMxLjAaHQoBMBIYChYIB0ISEhBBcmlhbCBVbmljb2RlIE1TGh0KATESGAoWCAdCEhIQQXJpYWwgVW5pY29kZSBNUxodCgEyEhgKFggHQhISEEFyaWFsIFVuaWNvZGUgTVMaHQoBMxIYChYIB0ISEhBBcmlhbCBVbmljb2RlIE1TOAByITFONk1Sek10SmEtcS1oZFVTNno0UnBvakRBN3VhMEpHbQ==</go:docsCustomData>
 </go:gDocsCustomXmlDataStorage>
 </file>
 

</xml_diff>